<commit_message>
fatto step 5. incrementato POI realistici tra le tappe e aggiunto/aggiornato funzionalità per renderle realistiche
</commit_message>
<xml_diff>
--- a/RiassuntoColloqui.docx
+++ b/RiassuntoColloqui.docx
@@ -43,15 +43,7 @@
         <w:t xml:space="preserve"> </w:t>
       </w:r>
       <w:r>
-        <w:t xml:space="preserve">PRIMA FARE RICERCA PER VEDERE LE ALTERNATIVE A QUEI 2 CHE MAGARI SONO </w:t>
-      </w:r>
-      <w:proofErr w:type="spellStart"/>
-      <w:r>
-        <w:t>PIù</w:t>
-      </w:r>
-      <w:proofErr w:type="spellEnd"/>
-      <w:r>
-        <w:t xml:space="preserve"> AST</w:t>
+        <w:t>PRIMA FARE RICERCA PER VEDERE LE ALTERNATIVE A QUEI 2 CHE MAGARI SONO PIù AST</w:t>
       </w:r>
       <w:r>
         <w:t>R</w:t>
@@ -70,15 +62,7 @@
         <w:sym w:font="Wingdings" w:char="F0E0"/>
       </w:r>
       <w:r>
-        <w:t xml:space="preserve">crea il progetto su </w:t>
-      </w:r>
-      <w:proofErr w:type="spellStart"/>
-      <w:r>
-        <w:t>github</w:t>
-      </w:r>
-      <w:proofErr w:type="spellEnd"/>
-      <w:r>
-        <w:t xml:space="preserve"> e invita il prof</w:t>
+        <w:t>crea il progetto su github e invita il prof</w:t>
       </w:r>
     </w:p>
     <w:p/>
@@ -93,73 +77,23 @@
         <w:sym w:font="Wingdings" w:char="F0E0"/>
       </w:r>
       <w:r>
-        <w:t xml:space="preserve">studiato con </w:t>
-      </w:r>
-      <w:proofErr w:type="spellStart"/>
-      <w:r>
-        <w:t>chatGPT</w:t>
-      </w:r>
-      <w:proofErr w:type="spellEnd"/>
-      <w:r>
-        <w:t xml:space="preserve"> cosa sono </w:t>
-      </w:r>
-      <w:proofErr w:type="spellStart"/>
-      <w:r>
-        <w:t>langChain</w:t>
-      </w:r>
-      <w:proofErr w:type="spellEnd"/>
-      <w:r>
-        <w:t xml:space="preserve"> e </w:t>
-      </w:r>
-      <w:proofErr w:type="spellStart"/>
-      <w:r>
-        <w:t>LanGraph</w:t>
-      </w:r>
-      <w:proofErr w:type="spellEnd"/>
-    </w:p>
-    <w:p>
-      <w:r>
-        <w:sym w:font="Wingdings" w:char="F0E0"/>
-      </w:r>
-      <w:r>
-        <w:t xml:space="preserve">guardato video tutorial su </w:t>
-      </w:r>
-      <w:proofErr w:type="spellStart"/>
-      <w:r>
-        <w:t>youtube</w:t>
-      </w:r>
-      <w:proofErr w:type="spellEnd"/>
-    </w:p>
-    <w:p>
-      <w:r>
-        <w:sym w:font="Wingdings" w:char="F0E0"/>
-      </w:r>
-      <w:r>
-        <w:t xml:space="preserve">creato </w:t>
-      </w:r>
-      <w:proofErr w:type="spellStart"/>
-      <w:r>
-        <w:t>virtual</w:t>
-      </w:r>
-      <w:proofErr w:type="spellEnd"/>
-      <w:r>
-        <w:t xml:space="preserve"> </w:t>
-      </w:r>
-      <w:proofErr w:type="spellStart"/>
-      <w:r>
-        <w:t>environment</w:t>
-      </w:r>
-      <w:proofErr w:type="spellEnd"/>
-      <w:r>
-        <w:t xml:space="preserve"> e installato </w:t>
-      </w:r>
-      <w:proofErr w:type="spellStart"/>
-      <w:r>
-        <w:t>langChain</w:t>
-      </w:r>
-      <w:proofErr w:type="spellEnd"/>
-      <w:r>
-        <w:t xml:space="preserve"> al suo interno</w:t>
+        <w:t>studiato con chatGPT cosa sono langChain e LanGraph</w:t>
+      </w:r>
+    </w:p>
+    <w:p>
+      <w:r>
+        <w:sym w:font="Wingdings" w:char="F0E0"/>
+      </w:r>
+      <w:r>
+        <w:t>guardato video tutorial su youtube</w:t>
+      </w:r>
+    </w:p>
+    <w:p>
+      <w:r>
+        <w:sym w:font="Wingdings" w:char="F0E0"/>
+      </w:r>
+      <w:r>
+        <w:t>creato virtual environment e installato langChain al suo interno</w:t>
       </w:r>
     </w:p>
     <w:p>
@@ -172,13 +106,8 @@
         <w:sym w:font="Wingdings" w:char="F0E0"/>
       </w:r>
       <w:r>
-        <w:t xml:space="preserve">fatto un primo script </w:t>
-      </w:r>
-      <w:proofErr w:type="spellStart"/>
-      <w:r>
-        <w:t>LangChain</w:t>
-      </w:r>
-      <w:proofErr w:type="spellEnd"/>
+        <w:t>fatto un primo script LangChain</w:t>
+      </w:r>
     </w:p>
     <w:p>
       <w:r>
@@ -195,13 +124,8 @@
         <w:sym w:font="Wingdings" w:char="F0E0"/>
       </w:r>
       <w:r>
-        <w:t xml:space="preserve">fatto piccolo chatbot con </w:t>
-      </w:r>
-      <w:proofErr w:type="spellStart"/>
-      <w:r>
-        <w:t>LangChain</w:t>
-      </w:r>
-      <w:proofErr w:type="spellEnd"/>
+        <w:t>fatto piccolo chatbot con LangChain</w:t>
+      </w:r>
     </w:p>
     <w:p>
       <w:r>
@@ -213,13 +137,8 @@
         <w:sym w:font="Wingdings" w:char="F0E0"/>
       </w:r>
       <w:r>
-        <w:t xml:space="preserve">Aggiunto memoria al </w:t>
-      </w:r>
-      <w:proofErr w:type="spellStart"/>
-      <w:r>
-        <w:t>both</w:t>
-      </w:r>
-      <w:proofErr w:type="spellEnd"/>
+        <w:t>Aggiunto memoria al both</w:t>
+      </w:r>
     </w:p>
     <w:p>
       <w:r>
@@ -239,21 +158,8 @@
         <w:sym w:font="Wingdings" w:char="F0E0"/>
       </w:r>
       <w:r>
-        <w:t xml:space="preserve">studiato nuovo framework forse più adatto di </w:t>
-      </w:r>
-      <w:proofErr w:type="spellStart"/>
-      <w:r>
-        <w:t>LangChain</w:t>
-      </w:r>
-      <w:proofErr w:type="spellEnd"/>
-      <w:r>
-        <w:t xml:space="preserve">, </w:t>
-      </w:r>
-      <w:proofErr w:type="spellStart"/>
-      <w:r>
-        <w:t>PydanticAI</w:t>
-      </w:r>
-      <w:proofErr w:type="spellEnd"/>
+        <w:t>studiato nuovo framework forse più adatto di LangChain, PydanticAI</w:t>
+      </w:r>
     </w:p>
     <w:p>
       <w:r>
@@ -265,34 +171,16 @@
         <w:sym w:font="Wingdings" w:char="F0E0"/>
       </w:r>
       <w:r>
-        <w:t xml:space="preserve">Fatto bot con </w:t>
-      </w:r>
-      <w:proofErr w:type="spellStart"/>
-      <w:r>
-        <w:t>pydanticAI</w:t>
-      </w:r>
-      <w:proofErr w:type="spellEnd"/>
-    </w:p>
-    <w:p>
-      <w:r>
-        <w:sym w:font="Wingdings" w:char="F0E0"/>
-      </w:r>
-      <w:r>
-        <w:t xml:space="preserve">fatto agente meteo con </w:t>
-      </w:r>
-      <w:proofErr w:type="spellStart"/>
-      <w:r>
-        <w:t>pydantiAI</w:t>
-      </w:r>
-      <w:proofErr w:type="spellEnd"/>
-      <w:r>
-        <w:t xml:space="preserve"> e </w:t>
-      </w:r>
-      <w:proofErr w:type="spellStart"/>
-      <w:r>
-        <w:t>groq</w:t>
-      </w:r>
-      <w:proofErr w:type="spellEnd"/>
+        <w:t>Fatto bot con pydanticAI</w:t>
+      </w:r>
+    </w:p>
+    <w:p>
+      <w:r>
+        <w:sym w:font="Wingdings" w:char="F0E0"/>
+      </w:r>
+      <w:r>
+        <w:t>fatto agente meteo con pydantiAI e groq</w:t>
+      </w:r>
     </w:p>
     <w:p>
       <w:pPr>
@@ -315,36 +203,7 @@
         <w:sym w:font="Wingdings" w:char="F0E0"/>
       </w:r>
       <w:r>
-        <w:t xml:space="preserve">modificato agente meteo cambiando </w:t>
-      </w:r>
-      <w:proofErr w:type="spellStart"/>
-      <w:r>
-        <w:t>llm</w:t>
-      </w:r>
-      <w:proofErr w:type="spellEnd"/>
-      <w:r>
-        <w:t xml:space="preserve">. Da </w:t>
-      </w:r>
-      <w:proofErr w:type="spellStart"/>
-      <w:r>
-        <w:t>groq</w:t>
-      </w:r>
-      <w:proofErr w:type="spellEnd"/>
-      <w:r>
-        <w:t xml:space="preserve"> a </w:t>
-      </w:r>
-      <w:proofErr w:type="spellStart"/>
-      <w:proofErr w:type="gramStart"/>
-      <w:r>
-        <w:t>Ollama</w:t>
-      </w:r>
-      <w:proofErr w:type="spellEnd"/>
-      <w:r>
-        <w:t>(</w:t>
-      </w:r>
-      <w:proofErr w:type="gramEnd"/>
-      <w:r>
-        <w:t>Mistral)</w:t>
+        <w:t>modificato agente meteo cambiando llm. Da groq a Ollama(Mistral)</w:t>
       </w:r>
     </w:p>
     <w:p>
@@ -357,15 +216,7 @@
         <w:sym w:font="Wingdings" w:char="F0E0"/>
       </w:r>
       <w:r>
-        <w:t xml:space="preserve">iniziato a </w:t>
-      </w:r>
-      <w:proofErr w:type="gramStart"/>
-      <w:r>
-        <w:t>fere documentazione</w:t>
-      </w:r>
-      <w:proofErr w:type="gramEnd"/>
-      <w:r>
-        <w:t xml:space="preserve"> progetto in file latex</w:t>
+        <w:t>iniziato a fere documentazione progetto in file latex</w:t>
       </w:r>
     </w:p>
     <w:p>
@@ -432,47 +283,7 @@
           <w:szCs w:val="22"/>
           <w:lang w:eastAsia="en-US"/>
         </w:rPr>
-        <w:t xml:space="preserve">In questa fase ho impostato l’architettura iniziale del progetto e definito tutte le strutture dati principali utilizzando </w:t>
-      </w:r>
-      <w:proofErr w:type="spellStart"/>
-      <w:r>
-        <w:rPr>
-          <w:rFonts w:asciiTheme="minorHAnsi" w:eastAsiaTheme="minorHAnsi" w:hAnsiTheme="minorHAnsi" w:cstheme="minorBidi"/>
-          <w:sz w:val="22"/>
-          <w:szCs w:val="22"/>
-          <w:lang w:eastAsia="en-US"/>
-        </w:rPr>
-        <w:t>FastAPI</w:t>
-      </w:r>
-      <w:proofErr w:type="spellEnd"/>
-      <w:r>
-        <w:rPr>
-          <w:rFonts w:asciiTheme="minorHAnsi" w:eastAsiaTheme="minorHAnsi" w:hAnsiTheme="minorHAnsi" w:cstheme="minorBidi"/>
-          <w:sz w:val="22"/>
-          <w:szCs w:val="22"/>
-          <w:lang w:eastAsia="en-US"/>
-        </w:rPr>
-        <w:t xml:space="preserve"> e </w:t>
-      </w:r>
-      <w:proofErr w:type="spellStart"/>
-      <w:r>
-        <w:rPr>
-          <w:rFonts w:asciiTheme="minorHAnsi" w:eastAsiaTheme="minorHAnsi" w:hAnsiTheme="minorHAnsi" w:cstheme="minorBidi"/>
-          <w:sz w:val="22"/>
-          <w:szCs w:val="22"/>
-          <w:lang w:eastAsia="en-US"/>
-        </w:rPr>
-        <w:t>Pydantic</w:t>
-      </w:r>
-      <w:proofErr w:type="spellEnd"/>
-      <w:r>
-        <w:rPr>
-          <w:rFonts w:asciiTheme="minorHAnsi" w:eastAsiaTheme="minorHAnsi" w:hAnsiTheme="minorHAnsi" w:cstheme="minorBidi"/>
-          <w:sz w:val="22"/>
-          <w:szCs w:val="22"/>
-          <w:lang w:eastAsia="en-US"/>
-        </w:rPr>
-        <w:t xml:space="preserve"> (modelli per richieste, preferenze, tappe e piano di viaggio).</w:t>
+        <w:t>In questa fase ho impostato l’architettura iniziale del progetto e definito tutte le strutture dati principali utilizzando FastAPI e Pydantic (modelli per richieste, preferenze, tappe e piano di viaggio).</w:t>
       </w:r>
     </w:p>
     <w:p>
@@ -493,47 +304,7 @@
           <w:lang w:eastAsia="en-US"/>
         </w:rPr>
         <w:lastRenderedPageBreak/>
-        <w:t xml:space="preserve">Ho implementato un primo flusso completo dell’applicazione: – ricezione dei dati tramite endpoint </w:t>
-      </w:r>
-      <w:proofErr w:type="spellStart"/>
-      <w:r>
-        <w:rPr>
-          <w:rFonts w:asciiTheme="minorHAnsi" w:eastAsiaTheme="minorHAnsi" w:hAnsiTheme="minorHAnsi" w:cstheme="minorBidi"/>
-          <w:sz w:val="22"/>
-          <w:szCs w:val="22"/>
-          <w:lang w:eastAsia="en-US"/>
-        </w:rPr>
-        <w:t>FastAPI</w:t>
-      </w:r>
-      <w:proofErr w:type="spellEnd"/>
-      <w:r>
-        <w:rPr>
-          <w:rFonts w:asciiTheme="minorHAnsi" w:eastAsiaTheme="minorHAnsi" w:hAnsiTheme="minorHAnsi" w:cstheme="minorBidi"/>
-          <w:sz w:val="22"/>
-          <w:szCs w:val="22"/>
-          <w:lang w:eastAsia="en-US"/>
-        </w:rPr>
-        <w:t xml:space="preserve"> – validazione automatica tramite modelli </w:t>
-      </w:r>
-      <w:proofErr w:type="spellStart"/>
-      <w:r>
-        <w:rPr>
-          <w:rFonts w:asciiTheme="minorHAnsi" w:eastAsiaTheme="minorHAnsi" w:hAnsiTheme="minorHAnsi" w:cstheme="minorBidi"/>
-          <w:sz w:val="22"/>
-          <w:szCs w:val="22"/>
-          <w:lang w:eastAsia="en-US"/>
-        </w:rPr>
-        <w:t>Pydantic</w:t>
-      </w:r>
-      <w:proofErr w:type="spellEnd"/>
-      <w:r>
-        <w:rPr>
-          <w:rFonts w:asciiTheme="minorHAnsi" w:eastAsiaTheme="minorHAnsi" w:hAnsiTheme="minorHAnsi" w:cstheme="minorBidi"/>
-          <w:sz w:val="22"/>
-          <w:szCs w:val="22"/>
-          <w:lang w:eastAsia="en-US"/>
-        </w:rPr>
-        <w:t xml:space="preserve"> – generazione di un itinerario di prova basato sui parametri forniti – creazione di un documento riassuntivo dell’itinerario</w:t>
+        <w:t>Ho implementato un primo flusso completo dell’applicazione: – ricezione dei dati tramite endpoint FastAPI – validazione automatica tramite modelli Pydantic – generazione di un itinerario di prova basato sui parametri forniti – creazione di un documento riassuntivo dell’itinerario</w:t>
       </w:r>
     </w:p>
     <w:p>
@@ -555,7 +326,6 @@
         </w:rPr>
         <w:t xml:space="preserve">Ho inoltre configurato un sistema di test utilizzando un file JSON esterno e richieste HTTP simulate tramite </w:t>
       </w:r>
-      <w:proofErr w:type="spellStart"/>
       <w:r>
         <w:rPr>
           <w:rFonts w:asciiTheme="minorHAnsi" w:eastAsiaTheme="minorHAnsi" w:hAnsiTheme="minorHAnsi" w:cstheme="minorBidi"/>
@@ -567,7 +337,6 @@
         </w:rPr>
         <w:t>curl</w:t>
       </w:r>
-      <w:proofErr w:type="spellEnd"/>
       <w:r>
         <w:rPr>
           <w:rFonts w:asciiTheme="minorHAnsi" w:eastAsiaTheme="minorHAnsi" w:hAnsiTheme="minorHAnsi" w:cstheme="minorBidi"/>
@@ -575,27 +344,7 @@
           <w:szCs w:val="22"/>
           <w:lang w:eastAsia="en-US"/>
         </w:rPr>
-        <w:t xml:space="preserve">, per verificare che </w:t>
-      </w:r>
-      <w:proofErr w:type="gramStart"/>
-      <w:r>
-        <w:rPr>
-          <w:rFonts w:asciiTheme="minorHAnsi" w:eastAsiaTheme="minorHAnsi" w:hAnsiTheme="minorHAnsi" w:cstheme="minorBidi"/>
-          <w:sz w:val="22"/>
-          <w:szCs w:val="22"/>
-          <w:lang w:eastAsia="en-US"/>
-        </w:rPr>
-        <w:t>l’intero pipeline</w:t>
-      </w:r>
-      <w:proofErr w:type="gramEnd"/>
-      <w:r>
-        <w:rPr>
-          <w:rFonts w:asciiTheme="minorHAnsi" w:eastAsiaTheme="minorHAnsi" w:hAnsiTheme="minorHAnsi" w:cstheme="minorBidi"/>
-          <w:sz w:val="22"/>
-          <w:szCs w:val="22"/>
-          <w:lang w:eastAsia="en-US"/>
-        </w:rPr>
-        <w:t xml:space="preserve"> (input → logica → output) funzionasse correttamente.</w:t>
+        <w:t>, per verificare che l’intero pipeline (input → logica → output) funzionasse correttamente.</w:t>
       </w:r>
     </w:p>
     <w:p>
@@ -640,6 +389,153 @@
         </w:rPr>
         <w:t>28/05/2026</w:t>
       </w:r>
+    </w:p>
+    <w:p>
+      <w:pPr>
+        <w:pStyle w:val="NormaleWeb"/>
+        <w:pBdr>
+          <w:bottom w:val="single" w:sz="6" w:space="1" w:color="auto"/>
+        </w:pBdr>
+      </w:pPr>
+      <w:r>
+        <w:rPr>
+          <w:rFonts w:asciiTheme="minorHAnsi" w:eastAsiaTheme="minorHAnsi" w:hAnsiTheme="minorHAnsi" w:cstheme="minorBidi"/>
+          <w:sz w:val="22"/>
+          <w:szCs w:val="22"/>
+          <w:lang w:eastAsia="en-US"/>
+        </w:rPr>
+        <w:sym w:font="Wingdings" w:char="F0E0"/>
+      </w:r>
+      <w:r>
+        <w:rPr>
+          <w:rFonts w:asciiTheme="minorHAnsi" w:eastAsiaTheme="minorHAnsi" w:hAnsiTheme="minorHAnsi" w:cstheme="minorBidi"/>
+          <w:sz w:val="22"/>
+          <w:szCs w:val="22"/>
+          <w:lang w:eastAsia="en-US"/>
+        </w:rPr>
+        <w:t>step 2: sostituzione d</w:t>
+      </w:r>
+      <w:r>
+        <w:t>istanza finta con una distanza reale ottenuta da un servizio esterno (OpenRouteService)</w:t>
+      </w:r>
+    </w:p>
+    <w:p>
+      <w:pPr>
+        <w:pStyle w:val="NormaleWeb"/>
+      </w:pPr>
+      <w:r>
+        <w:t>29/04/2026</w:t>
+      </w:r>
+    </w:p>
+    <w:p>
+      <w:pPr>
+        <w:pStyle w:val="NormaleWeb"/>
+        <w:pBdr>
+          <w:bottom w:val="single" w:sz="6" w:space="1" w:color="auto"/>
+        </w:pBdr>
+      </w:pPr>
+      <w:r>
+        <w:sym w:font="Wingdings" w:char="F0E0"/>
+      </w:r>
+      <w:r>
+        <w:t>step3</w:t>
+      </w:r>
+      <w:r>
+        <w:t>.1</w:t>
+      </w:r>
+      <w:r>
+        <w:t>:</w:t>
+      </w:r>
+      <w:r>
+        <w:t xml:space="preserve"> </w:t>
+      </w:r>
+      <w:r>
+        <w:t xml:space="preserve">Obiettivo: decidere </w:t>
+      </w:r>
+      <w:r>
+        <w:rPr>
+          <w:rStyle w:val="Enfasigrassetto"/>
+        </w:rPr>
+        <w:t>quante tappe</w:t>
+      </w:r>
+      <w:r>
+        <w:t xml:space="preserve"> servono per coprire la distanza totale (formula= distanzaTotale/DistanzaMaxGiornaliera)</w:t>
+      </w:r>
+    </w:p>
+    <w:p>
+      <w:pPr>
+        <w:pStyle w:val="NormaleWeb"/>
+      </w:pPr>
+      <w:r>
+        <w:t>30/04/2026</w:t>
+      </w:r>
+    </w:p>
+    <w:p>
+      <w:pPr>
+        <w:pStyle w:val="NormaleWeb"/>
+        <w:pBdr>
+          <w:bottom w:val="single" w:sz="6" w:space="1" w:color="auto"/>
+        </w:pBdr>
+        <w:tabs>
+          <w:tab w:val="left" w:pos="2381"/>
+        </w:tabs>
+      </w:pPr>
+      <w:r>
+        <w:sym w:font="Wingdings" w:char="F0E0"/>
+      </w:r>
+      <w:r>
+        <w:t>step3.2</w:t>
+      </w:r>
+      <w:r>
+        <w:t>, 3.3,3.4</w:t>
+      </w:r>
+      <w:r>
+        <w:tab/>
+      </w:r>
+    </w:p>
+    <w:p>
+      <w:pPr>
+        <w:pStyle w:val="NormaleWeb"/>
+        <w:tabs>
+          <w:tab w:val="left" w:pos="2381"/>
+        </w:tabs>
+      </w:pPr>
+      <w:r>
+        <w:t>01/05/2026</w:t>
+      </w:r>
+    </w:p>
+    <w:p>
+      <w:pPr>
+        <w:pStyle w:val="NormaleWeb"/>
+        <w:tabs>
+          <w:tab w:val="left" w:pos="2381"/>
+        </w:tabs>
+      </w:pPr>
+      <w:r>
+        <w:sym w:font="Wingdings" w:char="F0E0"/>
+      </w:r>
+      <w:r>
+        <w:t>step 3.5</w:t>
+      </w:r>
+    </w:p>
+    <w:p>
+      <w:pPr>
+        <w:pStyle w:val="NormaleWeb"/>
+      </w:pPr>
+      <w:r>
+        <w:t xml:space="preserve"> </w:t>
+      </w:r>
+    </w:p>
+    <w:p>
+      <w:pPr>
+        <w:pStyle w:val="NormaleWeb"/>
+        <w:rPr>
+          <w:rFonts w:asciiTheme="minorHAnsi" w:eastAsiaTheme="minorHAnsi" w:hAnsiTheme="minorHAnsi" w:cstheme="minorBidi"/>
+          <w:sz w:val="22"/>
+          <w:szCs w:val="22"/>
+          <w:lang w:eastAsia="en-US"/>
+        </w:rPr>
+      </w:pPr>
     </w:p>
     <w:p>
       <w:pPr>
@@ -890,6 +786,118 @@
     </w:lvl>
   </w:abstractNum>
   <w:abstractNum w:abstractNumId="2" w15:restartNumberingAfterBreak="0">
+    <w:nsid w:val="32D71396"/>
+    <w:multiLevelType w:val="hybridMultilevel"/>
+    <w:tmpl w:val="6B8E9E00"/>
+    <w:lvl w:ilvl="0" w:tplc="B32E91F8">
+      <w:numFmt w:val="bullet"/>
+      <w:lvlText w:val=""/>
+      <w:lvlJc w:val="left"/>
+      <w:pPr>
+        <w:ind w:left="720" w:hanging="360"/>
+      </w:pPr>
+      <w:rPr>
+        <w:rFonts w:ascii="Wingdings" w:eastAsiaTheme="minorHAnsi" w:hAnsi="Wingdings" w:cstheme="minorBidi" w:hint="default"/>
+      </w:rPr>
+    </w:lvl>
+    <w:lvl w:ilvl="1" w:tplc="04100003" w:tentative="1">
+      <w:start w:val="1"/>
+      <w:numFmt w:val="bullet"/>
+      <w:lvlText w:val="o"/>
+      <w:lvlJc w:val="left"/>
+      <w:pPr>
+        <w:ind w:left="1440" w:hanging="360"/>
+      </w:pPr>
+      <w:rPr>
+        <w:rFonts w:ascii="Courier New" w:hAnsi="Courier New" w:cs="Courier New" w:hint="default"/>
+      </w:rPr>
+    </w:lvl>
+    <w:lvl w:ilvl="2" w:tplc="04100005" w:tentative="1">
+      <w:start w:val="1"/>
+      <w:numFmt w:val="bullet"/>
+      <w:lvlText w:val=""/>
+      <w:lvlJc w:val="left"/>
+      <w:pPr>
+        <w:ind w:left="2160" w:hanging="360"/>
+      </w:pPr>
+      <w:rPr>
+        <w:rFonts w:ascii="Wingdings" w:hAnsi="Wingdings" w:hint="default"/>
+      </w:rPr>
+    </w:lvl>
+    <w:lvl w:ilvl="3" w:tplc="04100001" w:tentative="1">
+      <w:start w:val="1"/>
+      <w:numFmt w:val="bullet"/>
+      <w:lvlText w:val=""/>
+      <w:lvlJc w:val="left"/>
+      <w:pPr>
+        <w:ind w:left="2880" w:hanging="360"/>
+      </w:pPr>
+      <w:rPr>
+        <w:rFonts w:ascii="Symbol" w:hAnsi="Symbol" w:hint="default"/>
+      </w:rPr>
+    </w:lvl>
+    <w:lvl w:ilvl="4" w:tplc="04100003" w:tentative="1">
+      <w:start w:val="1"/>
+      <w:numFmt w:val="bullet"/>
+      <w:lvlText w:val="o"/>
+      <w:lvlJc w:val="left"/>
+      <w:pPr>
+        <w:ind w:left="3600" w:hanging="360"/>
+      </w:pPr>
+      <w:rPr>
+        <w:rFonts w:ascii="Courier New" w:hAnsi="Courier New" w:cs="Courier New" w:hint="default"/>
+      </w:rPr>
+    </w:lvl>
+    <w:lvl w:ilvl="5" w:tplc="04100005" w:tentative="1">
+      <w:start w:val="1"/>
+      <w:numFmt w:val="bullet"/>
+      <w:lvlText w:val=""/>
+      <w:lvlJc w:val="left"/>
+      <w:pPr>
+        <w:ind w:left="4320" w:hanging="360"/>
+      </w:pPr>
+      <w:rPr>
+        <w:rFonts w:ascii="Wingdings" w:hAnsi="Wingdings" w:hint="default"/>
+      </w:rPr>
+    </w:lvl>
+    <w:lvl w:ilvl="6" w:tplc="04100001" w:tentative="1">
+      <w:start w:val="1"/>
+      <w:numFmt w:val="bullet"/>
+      <w:lvlText w:val=""/>
+      <w:lvlJc w:val="left"/>
+      <w:pPr>
+        <w:ind w:left="5040" w:hanging="360"/>
+      </w:pPr>
+      <w:rPr>
+        <w:rFonts w:ascii="Symbol" w:hAnsi="Symbol" w:hint="default"/>
+      </w:rPr>
+    </w:lvl>
+    <w:lvl w:ilvl="7" w:tplc="04100003" w:tentative="1">
+      <w:start w:val="1"/>
+      <w:numFmt w:val="bullet"/>
+      <w:lvlText w:val="o"/>
+      <w:lvlJc w:val="left"/>
+      <w:pPr>
+        <w:ind w:left="5760" w:hanging="360"/>
+      </w:pPr>
+      <w:rPr>
+        <w:rFonts w:ascii="Courier New" w:hAnsi="Courier New" w:cs="Courier New" w:hint="default"/>
+      </w:rPr>
+    </w:lvl>
+    <w:lvl w:ilvl="8" w:tplc="04100005" w:tentative="1">
+      <w:start w:val="1"/>
+      <w:numFmt w:val="bullet"/>
+      <w:lvlText w:val=""/>
+      <w:lvlJc w:val="left"/>
+      <w:pPr>
+        <w:ind w:left="6480" w:hanging="360"/>
+      </w:pPr>
+      <w:rPr>
+        <w:rFonts w:ascii="Wingdings" w:hAnsi="Wingdings" w:hint="default"/>
+      </w:rPr>
+    </w:lvl>
+  </w:abstractNum>
+  <w:abstractNum w:abstractNumId="3" w15:restartNumberingAfterBreak="0">
     <w:nsid w:val="36922EC3"/>
     <w:multiLevelType w:val="hybridMultilevel"/>
     <w:tmpl w:val="860AD5CA"/>
@@ -1001,7 +1009,7 @@
       </w:rPr>
     </w:lvl>
   </w:abstractNum>
-  <w:abstractNum w:abstractNumId="3" w15:restartNumberingAfterBreak="0">
+  <w:abstractNum w:abstractNumId="4" w15:restartNumberingAfterBreak="0">
     <w:nsid w:val="3D193633"/>
     <w:multiLevelType w:val="hybridMultilevel"/>
     <w:tmpl w:val="D36C4C00"/>
@@ -1113,7 +1121,7 @@
       </w:rPr>
     </w:lvl>
   </w:abstractNum>
-  <w:abstractNum w:abstractNumId="4" w15:restartNumberingAfterBreak="0">
+  <w:abstractNum w:abstractNumId="5" w15:restartNumberingAfterBreak="0">
     <w:nsid w:val="63587183"/>
     <w:multiLevelType w:val="hybridMultilevel"/>
     <w:tmpl w:val="942869AA"/>
@@ -1232,13 +1240,16 @@
     <w:abstractNumId w:val="1"/>
   </w:num>
   <w:num w:numId="3" w16cid:durableId="467550114">
-    <w:abstractNumId w:val="2"/>
+    <w:abstractNumId w:val="3"/>
   </w:num>
   <w:num w:numId="4" w16cid:durableId="839470365">
-    <w:abstractNumId w:val="3"/>
+    <w:abstractNumId w:val="4"/>
   </w:num>
   <w:num w:numId="5" w16cid:durableId="861087366">
-    <w:abstractNumId w:val="4"/>
+    <w:abstractNumId w:val="5"/>
+  </w:num>
+  <w:num w:numId="6" w16cid:durableId="1103382411">
+    <w:abstractNumId w:val="2"/>
   </w:num>
 </w:numbering>
 </file>
@@ -1708,6 +1719,17 @@
       <w:iCs/>
     </w:rPr>
   </w:style>
+  <w:style w:type="character" w:styleId="Enfasigrassetto">
+    <w:name w:val="Strong"/>
+    <w:basedOn w:val="Carpredefinitoparagrafo"/>
+    <w:uiPriority w:val="22"/>
+    <w:qFormat/>
+    <w:rsid w:val="00F648C7"/>
+    <w:rPr>
+      <w:b/>
+      <w:bCs/>
+    </w:rPr>
+  </w:style>
 </w:styles>
 </file>
 

</xml_diff>